<commit_message>
Update English manuscript: protected table rows, 15 pages
</commit_message>
<xml_diff>
--- a/paper/paper_en_final.docx
+++ b/paper/paper_en_final.docx
@@ -353,6 +353,7 @@
       </w:tblGrid>
       <w:tr>
         <w:trPr>
+          <w:cantSplit/>
           <w:tblHeader/>
         </w:trPr>
         <w:tc>
@@ -481,6 +482,9 @@
         </w:tc>
       </w:tr>
       <w:tr>
+        <w:trPr>
+          <w:cantSplit/>
+        </w:trPr>
         <w:tc>
           <w:tcPr>
             <w:tcW w:type="dxa" w:w="2267"/>
@@ -607,6 +611,9 @@
         </w:tc>
       </w:tr>
       <w:tr>
+        <w:trPr>
+          <w:cantSplit/>
+        </w:trPr>
         <w:tc>
           <w:tcPr>
             <w:tcW w:type="dxa" w:w="2267"/>
@@ -733,6 +740,9 @@
         </w:tc>
       </w:tr>
       <w:tr>
+        <w:trPr>
+          <w:cantSplit/>
+        </w:trPr>
         <w:tc>
           <w:tcPr>
             <w:tcW w:type="dxa" w:w="2267"/>
@@ -1043,6 +1053,7 @@
       </w:tblGrid>
       <w:tr>
         <w:trPr>
+          <w:cantSplit/>
           <w:tblHeader/>
         </w:trPr>
         <w:tc>
@@ -1274,6 +1285,7 @@
       </w:tblGrid>
       <w:tr>
         <w:trPr>
+          <w:cantSplit/>
           <w:tblHeader/>
         </w:trPr>
         <w:tc>
@@ -1416,6 +1428,7 @@
       </w:tblGrid>
       <w:tr>
         <w:trPr>
+          <w:cantSplit/>
           <w:tblHeader/>
         </w:trPr>
         <w:tc>
@@ -1578,6 +1591,7 @@
       </w:tblGrid>
       <w:tr>
         <w:trPr>
+          <w:cantSplit/>
           <w:tblHeader/>
         </w:trPr>
         <w:tc>
@@ -1796,6 +1810,7 @@
       </w:tblGrid>
       <w:tr>
         <w:trPr>
+          <w:cantSplit/>
           <w:tblHeader/>
         </w:trPr>
         <w:tc>
@@ -1893,6 +1908,9 @@
         </w:tc>
       </w:tr>
       <w:tr>
+        <w:trPr>
+          <w:cantSplit/>
+        </w:trPr>
         <w:tc>
           <w:tcPr>
             <w:tcW w:type="dxa" w:w="3023"/>
@@ -1988,6 +2006,9 @@
         </w:tc>
       </w:tr>
       <w:tr>
+        <w:trPr>
+          <w:cantSplit/>
+        </w:trPr>
         <w:tc>
           <w:tcPr>
             <w:tcW w:type="dxa" w:w="3023"/>
@@ -2083,6 +2104,9 @@
         </w:tc>
       </w:tr>
       <w:tr>
+        <w:trPr>
+          <w:cantSplit/>
+        </w:trPr>
         <w:tc>
           <w:tcPr>
             <w:tcW w:type="dxa" w:w="3023"/>
@@ -2178,6 +2202,9 @@
         </w:tc>
       </w:tr>
       <w:tr>
+        <w:trPr>
+          <w:cantSplit/>
+        </w:trPr>
         <w:tc>
           <w:tcPr>
             <w:tcW w:type="dxa" w:w="3023"/>
@@ -2273,6 +2300,9 @@
         </w:tc>
       </w:tr>
       <w:tr>
+        <w:trPr>
+          <w:cantSplit/>
+        </w:trPr>
         <w:tc>
           <w:tcPr>
             <w:tcW w:type="dxa" w:w="3023"/>
@@ -2368,6 +2398,9 @@
         </w:tc>
       </w:tr>
       <w:tr>
+        <w:trPr>
+          <w:cantSplit/>
+        </w:trPr>
         <w:tc>
           <w:tcPr>
             <w:tcW w:type="dxa" w:w="3023"/>
@@ -2463,6 +2496,9 @@
         </w:tc>
       </w:tr>
       <w:tr>
+        <w:trPr>
+          <w:cantSplit/>
+        </w:trPr>
         <w:tc>
           <w:tcPr>
             <w:tcW w:type="dxa" w:w="3023"/>
@@ -2603,6 +2639,7 @@
       </w:tblGrid>
       <w:tr>
         <w:trPr>
+          <w:cantSplit/>
           <w:tblHeader/>
         </w:trPr>
         <w:tc>
@@ -2757,6 +2794,7 @@
       </w:tblGrid>
       <w:tr>
         <w:trPr>
+          <w:cantSplit/>
           <w:tblHeader/>
         </w:trPr>
         <w:tc>
@@ -2919,6 +2957,7 @@
       </w:tblGrid>
       <w:tr>
         <w:trPr>
+          <w:cantSplit/>
           <w:tblHeader/>
         </w:trPr>
         <w:tc>
@@ -3156,6 +3195,7 @@
       </w:tblGrid>
       <w:tr>
         <w:trPr>
+          <w:cantSplit/>
           <w:tblHeader/>
         </w:trPr>
         <w:tc>
@@ -3377,6 +3417,7 @@
       </w:tblGrid>
       <w:tr>
         <w:trPr>
+          <w:cantSplit/>
           <w:tblHeader/>
         </w:trPr>
         <w:tc>
@@ -3660,6 +3701,7 @@
       </w:tblGrid>
       <w:tr>
         <w:trPr>
+          <w:cantSplit/>
           <w:tblHeader/>
         </w:trPr>
         <w:tc>
@@ -3819,6 +3861,9 @@
         </w:tc>
       </w:tr>
       <w:tr>
+        <w:trPr>
+          <w:cantSplit/>
+        </w:trPr>
         <w:tc>
           <w:tcPr>
             <w:tcW w:type="dxa" w:w="1814"/>
@@ -3976,6 +4021,9 @@
         </w:tc>
       </w:tr>
       <w:tr>
+        <w:trPr>
+          <w:cantSplit/>
+        </w:trPr>
         <w:tc>
           <w:tcPr>
             <w:tcW w:type="dxa" w:w="1814"/>
@@ -4133,6 +4181,9 @@
         </w:tc>
       </w:tr>
       <w:tr>
+        <w:trPr>
+          <w:cantSplit/>
+        </w:trPr>
         <w:tc>
           <w:tcPr>
             <w:tcW w:type="dxa" w:w="1814"/>
@@ -4290,6 +4341,9 @@
         </w:tc>
       </w:tr>
       <w:tr>
+        <w:trPr>
+          <w:cantSplit/>
+        </w:trPr>
         <w:tc>
           <w:tcPr>
             <w:tcW w:type="dxa" w:w="1814"/>
@@ -4447,6 +4501,9 @@
         </w:tc>
       </w:tr>
       <w:tr>
+        <w:trPr>
+          <w:cantSplit/>
+        </w:trPr>
         <w:tc>
           <w:tcPr>
             <w:tcW w:type="dxa" w:w="1814"/>
@@ -4655,6 +4712,7 @@
       </w:tblGrid>
       <w:tr>
         <w:trPr>
+          <w:cantSplit/>
           <w:tblHeader/>
         </w:trPr>
         <w:tc>
@@ -4783,6 +4841,9 @@
         </w:tc>
       </w:tr>
       <w:tr>
+        <w:trPr>
+          <w:cantSplit/>
+        </w:trPr>
         <w:tc>
           <w:tcPr>
             <w:tcW w:type="dxa" w:w="2267"/>
@@ -4909,6 +4970,9 @@
         </w:tc>
       </w:tr>
       <w:tr>
+        <w:trPr>
+          <w:cantSplit/>
+        </w:trPr>
         <w:tc>
           <w:tcPr>
             <w:tcW w:type="dxa" w:w="2267"/>
@@ -5035,6 +5099,9 @@
         </w:tc>
       </w:tr>
       <w:tr>
+        <w:trPr>
+          <w:cantSplit/>
+        </w:trPr>
         <w:tc>
           <w:tcPr>
             <w:tcW w:type="dxa" w:w="2267"/>
@@ -5161,6 +5228,9 @@
         </w:tc>
       </w:tr>
       <w:tr>
+        <w:trPr>
+          <w:cantSplit/>
+        </w:trPr>
         <w:tc>
           <w:tcPr>
             <w:tcW w:type="dxa" w:w="2267"/>
@@ -5287,6 +5357,9 @@
         </w:tc>
       </w:tr>
       <w:tr>
+        <w:trPr>
+          <w:cantSplit/>
+        </w:trPr>
         <w:tc>
           <w:tcPr>
             <w:tcW w:type="dxa" w:w="2267"/>
@@ -5520,6 +5593,7 @@
       </w:tblGrid>
       <w:tr>
         <w:trPr>
+          <w:cantSplit/>
           <w:tblHeader/>
         </w:trPr>
         <w:tc>
@@ -5617,6 +5691,9 @@
         </w:tc>
       </w:tr>
       <w:tr>
+        <w:trPr>
+          <w:cantSplit/>
+        </w:trPr>
         <w:tc>
           <w:tcPr>
             <w:tcW w:type="dxa" w:w="3023"/>
@@ -5712,6 +5789,9 @@
         </w:tc>
       </w:tr>
       <w:tr>
+        <w:trPr>
+          <w:cantSplit/>
+        </w:trPr>
         <w:tc>
           <w:tcPr>
             <w:tcW w:type="dxa" w:w="3023"/>
@@ -5807,6 +5887,9 @@
         </w:tc>
       </w:tr>
       <w:tr>
+        <w:trPr>
+          <w:cantSplit/>
+        </w:trPr>
         <w:tc>
           <w:tcPr>
             <w:tcW w:type="dxa" w:w="3023"/>
@@ -5902,6 +5985,9 @@
         </w:tc>
       </w:tr>
       <w:tr>
+        <w:trPr>
+          <w:cantSplit/>
+        </w:trPr>
         <w:tc>
           <w:tcPr>
             <w:tcW w:type="dxa" w:w="3023"/>
@@ -5997,6 +6083,9 @@
         </w:tc>
       </w:tr>
       <w:tr>
+        <w:trPr>
+          <w:cantSplit/>
+        </w:trPr>
         <w:tc>
           <w:tcPr>
             <w:tcW w:type="dxa" w:w="3023"/>
@@ -6092,6 +6181,9 @@
         </w:tc>
       </w:tr>
       <w:tr>
+        <w:trPr>
+          <w:cantSplit/>
+        </w:trPr>
         <w:tc>
           <w:tcPr>
             <w:tcW w:type="dxa" w:w="3023"/>
@@ -6187,6 +6279,9 @@
         </w:tc>
       </w:tr>
       <w:tr>
+        <w:trPr>
+          <w:cantSplit/>
+        </w:trPr>
         <w:tc>
           <w:tcPr>
             <w:tcW w:type="dxa" w:w="3023"/>
@@ -6282,6 +6377,9 @@
         </w:tc>
       </w:tr>
       <w:tr>
+        <w:trPr>
+          <w:cantSplit/>
+        </w:trPr>
         <w:tc>
           <w:tcPr>
             <w:tcW w:type="dxa" w:w="3023"/>
@@ -6534,6 +6632,7 @@
       </w:tblGrid>
       <w:tr>
         <w:trPr>
+          <w:cantSplit/>
           <w:tblHeader/>
         </w:trPr>
         <w:tc>
@@ -6693,6 +6792,9 @@
         </w:tc>
       </w:tr>
       <w:tr>
+        <w:trPr>
+          <w:cantSplit/>
+        </w:trPr>
         <w:tc>
           <w:tcPr>
             <w:tcW w:type="dxa" w:w="1814"/>
@@ -6850,6 +6952,9 @@
         </w:tc>
       </w:tr>
       <w:tr>
+        <w:trPr>
+          <w:cantSplit/>
+        </w:trPr>
         <w:tc>
           <w:tcPr>
             <w:tcW w:type="dxa" w:w="1814"/>
@@ -7007,6 +7112,9 @@
         </w:tc>
       </w:tr>
       <w:tr>
+        <w:trPr>
+          <w:cantSplit/>
+        </w:trPr>
         <w:tc>
           <w:tcPr>
             <w:tcW w:type="dxa" w:w="1814"/>
@@ -7164,6 +7272,9 @@
         </w:tc>
       </w:tr>
       <w:tr>
+        <w:trPr>
+          <w:cantSplit/>
+        </w:trPr>
         <w:tc>
           <w:tcPr>
             <w:tcW w:type="dxa" w:w="1814"/>
@@ -7545,6 +7656,7 @@
       </w:tblGrid>
       <w:tr>
         <w:trPr>
+          <w:cantSplit/>
           <w:tblHeader/>
         </w:trPr>
         <w:tc>
@@ -7673,6 +7785,9 @@
         </w:tc>
       </w:tr>
       <w:tr>
+        <w:trPr>
+          <w:cantSplit/>
+        </w:trPr>
         <w:tc>
           <w:tcPr>
             <w:tcW w:type="dxa" w:w="2267"/>
@@ -7799,6 +7914,9 @@
         </w:tc>
       </w:tr>
       <w:tr>
+        <w:trPr>
+          <w:cantSplit/>
+        </w:trPr>
         <w:tc>
           <w:tcPr>
             <w:tcW w:type="dxa" w:w="2267"/>
@@ -7925,6 +8043,9 @@
         </w:tc>
       </w:tr>
       <w:tr>
+        <w:trPr>
+          <w:cantSplit/>
+        </w:trPr>
         <w:tc>
           <w:tcPr>
             <w:tcW w:type="dxa" w:w="2267"/>
@@ -8051,6 +8172,9 @@
         </w:tc>
       </w:tr>
       <w:tr>
+        <w:trPr>
+          <w:cantSplit/>
+        </w:trPr>
         <w:tc>
           <w:tcPr>
             <w:tcW w:type="dxa" w:w="2267"/>
@@ -8239,6 +8363,7 @@
       </w:tblGrid>
       <w:tr>
         <w:trPr>
+          <w:cantSplit/>
           <w:tblHeader/>
         </w:trPr>
         <w:tc>
@@ -8398,6 +8523,9 @@
         </w:tc>
       </w:tr>
       <w:tr>
+        <w:trPr>
+          <w:cantSplit/>
+        </w:trPr>
         <w:tc>
           <w:tcPr>
             <w:tcW w:type="dxa" w:w="1814"/>
@@ -8555,6 +8683,9 @@
         </w:tc>
       </w:tr>
       <w:tr>
+        <w:trPr>
+          <w:cantSplit/>
+        </w:trPr>
         <w:tc>
           <w:tcPr>
             <w:tcW w:type="dxa" w:w="1814"/>
@@ -8712,6 +8843,9 @@
         </w:tc>
       </w:tr>
       <w:tr>
+        <w:trPr>
+          <w:cantSplit/>
+        </w:trPr>
         <w:tc>
           <w:tcPr>
             <w:tcW w:type="dxa" w:w="1814"/>
@@ -8869,6 +9003,9 @@
         </w:tc>
       </w:tr>
       <w:tr>
+        <w:trPr>
+          <w:cantSplit/>
+        </w:trPr>
         <w:tc>
           <w:tcPr>
             <w:tcW w:type="dxa" w:w="1814"/>
@@ -9026,6 +9163,9 @@
         </w:tc>
       </w:tr>
       <w:tr>
+        <w:trPr>
+          <w:cantSplit/>
+        </w:trPr>
         <w:tc>
           <w:tcPr>
             <w:tcW w:type="dxa" w:w="1814"/>
@@ -9183,6 +9323,9 @@
         </w:tc>
       </w:tr>
       <w:tr>
+        <w:trPr>
+          <w:cantSplit/>
+        </w:trPr>
         <w:tc>
           <w:tcPr>
             <w:tcW w:type="dxa" w:w="1814"/>
@@ -9340,6 +9483,9 @@
         </w:tc>
       </w:tr>
       <w:tr>
+        <w:trPr>
+          <w:cantSplit/>
+        </w:trPr>
         <w:tc>
           <w:tcPr>
             <w:tcW w:type="dxa" w:w="1814"/>

</xml_diff>